<commit_message>
Set tblGrid widths so Word honours the fixed table layout
Cell tcW alone leaves Word splitting columns evenly under a fixed
layout. All eleven tables now total 8610 twips, matching the template.
</commit_message>
<xml_diff>
--- a/docs/SRS_Podcast_Guest_Scheduling_v1.0.docx
+++ b/docs/SRS_Podcast_Guest_Scheduling_v1.0.docx
@@ -66,13 +66,14 @@
           <w:insideV w:val="single" w:sz="8" w:space="0" w:color="000000"/>
         </w:tblBorders>
         <w:tblLayout w:type="fixed"/>
+        <w:tblW w:w="8610" w:type="dxa"/>
       </w:tblPr>
       <w:tblGrid>
-        <w:gridCol w:w="1728"/>
-        <w:gridCol w:w="1728"/>
-        <w:gridCol w:w="1728"/>
-        <w:gridCol w:w="1728"/>
-        <w:gridCol w:w="1728"/>
+        <w:gridCol w:w="1080"/>
+        <w:gridCol w:w="1296"/>
+        <w:gridCol w:w="2304"/>
+        <w:gridCol w:w="2880"/>
+        <w:gridCol w:w="1050"/>
       </w:tblGrid>
       <w:tr>
         <w:trPr>
@@ -376,12 +377,13 @@
           <w:insideV w:val="single" w:sz="8" w:space="0" w:color="000000"/>
         </w:tblBorders>
         <w:tblLayout w:type="fixed"/>
+        <w:tblW w:w="8610" w:type="dxa"/>
       </w:tblPr>
       <w:tblGrid>
         <w:gridCol w:w="2160"/>
-        <w:gridCol w:w="2160"/>
-        <w:gridCol w:w="2160"/>
-        <w:gridCol w:w="2160"/>
+        <w:gridCol w:w="2448"/>
+        <w:gridCol w:w="2592"/>
+        <w:gridCol w:w="1410"/>
       </w:tblGrid>
       <w:tr>
         <w:trPr>
@@ -1048,15 +1050,16 @@
           <w:insideV w:val="single" w:sz="8" w:space="0" w:color="000000"/>
         </w:tblBorders>
         <w:tblLayout w:type="fixed"/>
+        <w:tblW w:w="8610" w:type="dxa"/>
       </w:tblPr>
       <w:tblGrid>
-        <w:gridCol w:w="1234"/>
-        <w:gridCol w:w="1234"/>
-        <w:gridCol w:w="1234"/>
-        <w:gridCol w:w="1234"/>
-        <w:gridCol w:w="1234"/>
-        <w:gridCol w:w="1234"/>
-        <w:gridCol w:w="1234"/>
+        <w:gridCol w:w="860"/>
+        <w:gridCol w:w="2370"/>
+        <w:gridCol w:w="645"/>
+        <w:gridCol w:w="645"/>
+        <w:gridCol w:w="1150"/>
+        <w:gridCol w:w="1935"/>
+        <w:gridCol w:w="1005"/>
       </w:tblGrid>
       <w:tr>
         <w:trPr>
@@ -1857,15 +1860,16 @@
           <w:insideV w:val="single" w:sz="8" w:space="0" w:color="000000"/>
         </w:tblBorders>
         <w:tblLayout w:type="fixed"/>
+        <w:tblW w:w="8610" w:type="dxa"/>
       </w:tblPr>
       <w:tblGrid>
-        <w:gridCol w:w="1234"/>
-        <w:gridCol w:w="1234"/>
-        <w:gridCol w:w="1234"/>
-        <w:gridCol w:w="1234"/>
-        <w:gridCol w:w="1234"/>
-        <w:gridCol w:w="1234"/>
-        <w:gridCol w:w="1234"/>
+        <w:gridCol w:w="860"/>
+        <w:gridCol w:w="2370"/>
+        <w:gridCol w:w="645"/>
+        <w:gridCol w:w="645"/>
+        <w:gridCol w:w="1150"/>
+        <w:gridCol w:w="1935"/>
+        <w:gridCol w:w="1005"/>
       </w:tblGrid>
       <w:tr>
         <w:trPr>
@@ -2538,15 +2542,16 @@
           <w:insideV w:val="single" w:sz="8" w:space="0" w:color="000000"/>
         </w:tblBorders>
         <w:tblLayout w:type="fixed"/>
+        <w:tblW w:w="8610" w:type="dxa"/>
       </w:tblPr>
       <w:tblGrid>
-        <w:gridCol w:w="1234"/>
-        <w:gridCol w:w="1234"/>
-        <w:gridCol w:w="1234"/>
-        <w:gridCol w:w="1234"/>
-        <w:gridCol w:w="1234"/>
-        <w:gridCol w:w="1234"/>
-        <w:gridCol w:w="1234"/>
+        <w:gridCol w:w="860"/>
+        <w:gridCol w:w="2370"/>
+        <w:gridCol w:w="645"/>
+        <w:gridCol w:w="645"/>
+        <w:gridCol w:w="1150"/>
+        <w:gridCol w:w="1935"/>
+        <w:gridCol w:w="1005"/>
       </w:tblGrid>
       <w:tr>
         <w:trPr>
@@ -3219,15 +3224,16 @@
           <w:insideV w:val="single" w:sz="8" w:space="0" w:color="000000"/>
         </w:tblBorders>
         <w:tblLayout w:type="fixed"/>
+        <w:tblW w:w="8610" w:type="dxa"/>
       </w:tblPr>
       <w:tblGrid>
-        <w:gridCol w:w="1234"/>
-        <w:gridCol w:w="1234"/>
-        <w:gridCol w:w="1234"/>
-        <w:gridCol w:w="1234"/>
-        <w:gridCol w:w="1234"/>
-        <w:gridCol w:w="1234"/>
-        <w:gridCol w:w="1234"/>
+        <w:gridCol w:w="860"/>
+        <w:gridCol w:w="2370"/>
+        <w:gridCol w:w="645"/>
+        <w:gridCol w:w="645"/>
+        <w:gridCol w:w="1150"/>
+        <w:gridCol w:w="1935"/>
+        <w:gridCol w:w="1005"/>
       </w:tblGrid>
       <w:tr>
         <w:trPr>
@@ -3900,15 +3906,16 @@
           <w:insideV w:val="single" w:sz="8" w:space="0" w:color="000000"/>
         </w:tblBorders>
         <w:tblLayout w:type="fixed"/>
+        <w:tblW w:w="8610" w:type="dxa"/>
       </w:tblPr>
       <w:tblGrid>
-        <w:gridCol w:w="1234"/>
-        <w:gridCol w:w="1234"/>
-        <w:gridCol w:w="1234"/>
-        <w:gridCol w:w="1234"/>
-        <w:gridCol w:w="1234"/>
-        <w:gridCol w:w="1234"/>
-        <w:gridCol w:w="1234"/>
+        <w:gridCol w:w="860"/>
+        <w:gridCol w:w="2370"/>
+        <w:gridCol w:w="645"/>
+        <w:gridCol w:w="645"/>
+        <w:gridCol w:w="1150"/>
+        <w:gridCol w:w="1935"/>
+        <w:gridCol w:w="1005"/>
       </w:tblGrid>
       <w:tr>
         <w:trPr>
@@ -4453,15 +4460,16 @@
           <w:insideV w:val="single" w:sz="8" w:space="0" w:color="000000"/>
         </w:tblBorders>
         <w:tblLayout w:type="fixed"/>
+        <w:tblW w:w="8610" w:type="dxa"/>
       </w:tblPr>
       <w:tblGrid>
-        <w:gridCol w:w="1234"/>
-        <w:gridCol w:w="1234"/>
-        <w:gridCol w:w="1234"/>
-        <w:gridCol w:w="1234"/>
-        <w:gridCol w:w="1234"/>
-        <w:gridCol w:w="1234"/>
-        <w:gridCol w:w="1234"/>
+        <w:gridCol w:w="860"/>
+        <w:gridCol w:w="2370"/>
+        <w:gridCol w:w="645"/>
+        <w:gridCol w:w="645"/>
+        <w:gridCol w:w="1150"/>
+        <w:gridCol w:w="1935"/>
+        <w:gridCol w:w="1005"/>
       </w:tblGrid>
       <w:tr>
         <w:trPr>
@@ -5006,13 +5014,14 @@
           <w:insideV w:val="single" w:sz="8" w:space="0" w:color="000000"/>
         </w:tblBorders>
         <w:tblLayout w:type="fixed"/>
+        <w:tblW w:w="8610" w:type="dxa"/>
       </w:tblPr>
       <w:tblGrid>
-        <w:gridCol w:w="1728"/>
-        <w:gridCol w:w="1728"/>
-        <w:gridCol w:w="1728"/>
-        <w:gridCol w:w="1728"/>
-        <w:gridCol w:w="1728"/>
+        <w:gridCol w:w="1080"/>
+        <w:gridCol w:w="3168"/>
+        <w:gridCol w:w="1368"/>
+        <w:gridCol w:w="864"/>
+        <w:gridCol w:w="2130"/>
       </w:tblGrid>
       <w:tr>
         <w:trPr>
@@ -5827,13 +5836,14 @@
           <w:insideV w:val="single" w:sz="8" w:space="0" w:color="000000"/>
         </w:tblBorders>
         <w:tblLayout w:type="fixed"/>
+        <w:tblW w:w="8610" w:type="dxa"/>
       </w:tblPr>
       <w:tblGrid>
-        <w:gridCol w:w="1728"/>
-        <w:gridCol w:w="1728"/>
-        <w:gridCol w:w="1728"/>
-        <w:gridCol w:w="1728"/>
-        <w:gridCol w:w="1728"/>
+        <w:gridCol w:w="1080"/>
+        <w:gridCol w:w="3600"/>
+        <w:gridCol w:w="1080"/>
+        <w:gridCol w:w="792"/>
+        <w:gridCol w:w="2058"/>
       </w:tblGrid>
       <w:tr>
         <w:trPr>
@@ -6711,15 +6721,16 @@
           <w:insideV w:val="single" w:sz="8" w:space="0" w:color="000000"/>
         </w:tblBorders>
         <w:tblLayout w:type="fixed"/>
+        <w:tblW w:w="8610" w:type="dxa"/>
       </w:tblPr>
       <w:tblGrid>
-        <w:gridCol w:w="1234"/>
-        <w:gridCol w:w="1234"/>
-        <w:gridCol w:w="1234"/>
-        <w:gridCol w:w="1234"/>
-        <w:gridCol w:w="1234"/>
-        <w:gridCol w:w="1234"/>
-        <w:gridCol w:w="1234"/>
+        <w:gridCol w:w="1224"/>
+        <w:gridCol w:w="1944"/>
+        <w:gridCol w:w="1512"/>
+        <w:gridCol w:w="1512"/>
+        <w:gridCol w:w="1224"/>
+        <w:gridCol w:w="648"/>
+        <w:gridCol w:w="546"/>
       </w:tblGrid>
       <w:tr>
         <w:trPr>

</xml_diff>